<commit_message>
Both submissions: mark authors as equal contributors (byline note + CRediT/author-contributions statements); rebuild IJMI+JHIR manuscript DOCX+PDF
Co-Authored-By: Claude Opus 4.8 <noreply@anthropic.com>
</commit_message>
<xml_diff>
--- a/submission/IJMI/manuscript.docx
+++ b/submission/IJMI/manuscript.docx
@@ -98,6 +98,18 @@
       </w:r>
       <w:r>
         <w:t xml:space="preserve"> Intelligent Systems, Afeka Academic College of Engineering, Tel-Aviv, Israel</w:t>
+      </w:r>
+    </w:p>
+    <w:p>
+      <w:pPr>
+        <w:pStyle w:val="BodyText"/>
+        <w:jc w:val="both"/>
+        <w:keepNext w:val="0"/>
+        <w:keepLines w:val="0"/>
+        <w:widowControl w:val="1"/>
+      </w:pPr>
+      <w:r>
+        <w:t xml:space="preserve">Alexander Apartsin and Yehudit Aperstein contributed equally to this work.</w:t>
       </w:r>
     </w:p>
     <w:bookmarkStart w:id="9" w:name="highlights"/>
@@ -20463,33 +20475,7 @@
         <w:widowControl w:val="1"/>
       </w:pPr>
       <w:r>
-        <w:rPr>
-          <w:b/>
-          <w:bCs/>
-        </w:rPr>
-        <w:t xml:space="preserve">Alexander Apartsin:</w:t>
-      </w:r>
-      <w:r>
-        <w:t xml:space="preserve"> </w:t>
-      </w:r>
-      <w:r>
-        <w:t xml:space="preserve">Conceptualization, Methodology, Software, Writing – original draft, Supervision.</w:t>
-      </w:r>
-      <w:r>
-        <w:t xml:space="preserve"> </w:t>
-      </w:r>
-      <w:r>
-        <w:rPr>
-          <w:b/>
-          <w:bCs/>
-        </w:rPr>
-        <w:t xml:space="preserve">Yehudit Aperstein:</w:t>
-      </w:r>
-      <w:r>
-        <w:t xml:space="preserve"> </w:t>
-      </w:r>
-      <w:r>
-        <w:t xml:space="preserve">Conceptualization, Writing – review &amp; editing, Supervision.</w:t>
+        <w:t xml:space="preserve">Alexander Apartsin and Yehudit Aperstein contributed equally to this work. Both authors: Conceptualization, Methodology, Software, Writing – original draft, Writing – review &amp; editing, Supervision.</w:t>
       </w:r>
     </w:p>
     <w:bookmarkEnd w:id="65"/>

</xml_diff>